<commit_message>
docs: tighten status board line spacing to fit one page
Co-Authored-By: Claude Opus 5.5 <noreply@anthropic.com>
Claude-Session: https://claude.ai/code/session_01Ev2GcePRwbwZKfH9HbtDvV
</commit_message>
<xml_diff>
--- a/docs/scrap-highlight/DS스크랩AI하이라이트_현황판.docx
+++ b/docs/scrap-highlight/DS스크랩AI하이라이트_현황판.docx
@@ -4,7 +4,7 @@
   <w:body>
     <w:p>
       <w:pPr>
-        <w:spacing w:after="40"/>
+        <w:spacing w:after="0" w:line="440" w:lineRule="exact"/>
         <w:jc w:val="center"/>
       </w:pPr>
       <w:r>
@@ -20,7 +20,7 @@
     </w:p>
     <w:p>
       <w:pPr>
-        <w:spacing w:after="120"/>
+        <w:spacing w:after="60" w:line="290" w:lineRule="exact"/>
         <w:jc w:val="center"/>
       </w:pPr>
       <w:r>
@@ -35,7 +35,7 @@
     <w:p>
       <w:pPr>
         <w:keepNext/>
-        <w:spacing w:after="100" w:before="240"/>
+        <w:spacing w:after="80" w:before="200" w:line="340" w:lineRule="exact"/>
       </w:pPr>
       <w:r>
         <w:rPr>
@@ -79,16 +79,16 @@
               <w:right w:val="single" w:color="000000" w:sz="4"/>
             </w:tcBorders>
             <w:tcMar>
-              <w:top w:type="dxa" w:w="30"/>
-              <w:left w:type="dxa" w:w="90"/>
-              <w:bottom w:type="dxa" w:w="30"/>
-              <w:right w:type="dxa" w:w="90"/>
-            </w:tcMar>
-            <w:vAlign w:val="center"/>
-          </w:tcPr>
-          <w:p>
-            <w:pPr>
-              <w:spacing w:after="0" w:line="264"/>
+              <w:top w:type="dxa" w:w="20"/>
+              <w:left w:type="dxa" w:w="80"/>
+              <w:bottom w:type="dxa" w:w="20"/>
+              <w:right w:type="dxa" w:w="80"/>
+            </w:tcMar>
+            <w:vAlign w:val="center"/>
+          </w:tcPr>
+          <w:p>
+            <w:pPr>
+              <w:spacing w:after="0" w:line="290" w:lineRule="exact"/>
               <w:jc w:val="center"/>
             </w:pPr>
             <w:r>
@@ -113,16 +113,16 @@
               <w:right w:val="single" w:color="000000" w:sz="4"/>
             </w:tcBorders>
             <w:tcMar>
-              <w:top w:type="dxa" w:w="30"/>
-              <w:left w:type="dxa" w:w="90"/>
-              <w:bottom w:type="dxa" w:w="30"/>
-              <w:right w:type="dxa" w:w="90"/>
-            </w:tcMar>
-            <w:vAlign w:val="center"/>
-          </w:tcPr>
-          <w:p>
-            <w:pPr>
-              <w:spacing w:after="0" w:line="264"/>
+              <w:top w:type="dxa" w:w="20"/>
+              <w:left w:type="dxa" w:w="80"/>
+              <w:bottom w:type="dxa" w:w="20"/>
+              <w:right w:type="dxa" w:w="80"/>
+            </w:tcMar>
+            <w:vAlign w:val="center"/>
+          </w:tcPr>
+          <w:p>
+            <w:pPr>
+              <w:spacing w:after="0" w:line="290" w:lineRule="exact"/>
               <w:jc w:val="left"/>
             </w:pPr>
             <w:r>
@@ -153,16 +153,16 @@
               <w:right w:val="single" w:color="000000" w:sz="4"/>
             </w:tcBorders>
             <w:tcMar>
-              <w:top w:type="dxa" w:w="30"/>
-              <w:left w:type="dxa" w:w="90"/>
-              <w:bottom w:type="dxa" w:w="30"/>
-              <w:right w:type="dxa" w:w="90"/>
-            </w:tcMar>
-            <w:vAlign w:val="center"/>
-          </w:tcPr>
-          <w:p>
-            <w:pPr>
-              <w:spacing w:after="0" w:line="264"/>
+              <w:top w:type="dxa" w:w="20"/>
+              <w:left w:type="dxa" w:w="80"/>
+              <w:bottom w:type="dxa" w:w="20"/>
+              <w:right w:type="dxa" w:w="80"/>
+            </w:tcMar>
+            <w:vAlign w:val="center"/>
+          </w:tcPr>
+          <w:p>
+            <w:pPr>
+              <w:spacing w:after="0" w:line="290" w:lineRule="exact"/>
               <w:jc w:val="center"/>
             </w:pPr>
             <w:r>
@@ -187,16 +187,16 @@
               <w:right w:val="single" w:color="000000" w:sz="4"/>
             </w:tcBorders>
             <w:tcMar>
-              <w:top w:type="dxa" w:w="30"/>
-              <w:left w:type="dxa" w:w="90"/>
-              <w:bottom w:type="dxa" w:w="30"/>
-              <w:right w:type="dxa" w:w="90"/>
-            </w:tcMar>
-            <w:vAlign w:val="center"/>
-          </w:tcPr>
-          <w:p>
-            <w:pPr>
-              <w:spacing w:after="0" w:line="264"/>
+              <w:top w:type="dxa" w:w="20"/>
+              <w:left w:type="dxa" w:w="80"/>
+              <w:bottom w:type="dxa" w:w="20"/>
+              <w:right w:type="dxa" w:w="80"/>
+            </w:tcMar>
+            <w:vAlign w:val="center"/>
+          </w:tcPr>
+          <w:p>
+            <w:pPr>
+              <w:spacing w:after="0" w:line="290" w:lineRule="exact"/>
               <w:jc w:val="left"/>
             </w:pPr>
             <w:r>
@@ -227,16 +227,16 @@
               <w:right w:val="single" w:color="000000" w:sz="4"/>
             </w:tcBorders>
             <w:tcMar>
-              <w:top w:type="dxa" w:w="30"/>
-              <w:left w:type="dxa" w:w="90"/>
-              <w:bottom w:type="dxa" w:w="30"/>
-              <w:right w:type="dxa" w:w="90"/>
-            </w:tcMar>
-            <w:vAlign w:val="center"/>
-          </w:tcPr>
-          <w:p>
-            <w:pPr>
-              <w:spacing w:after="0" w:line="264"/>
+              <w:top w:type="dxa" w:w="20"/>
+              <w:left w:type="dxa" w:w="80"/>
+              <w:bottom w:type="dxa" w:w="20"/>
+              <w:right w:type="dxa" w:w="80"/>
+            </w:tcMar>
+            <w:vAlign w:val="center"/>
+          </w:tcPr>
+          <w:p>
+            <w:pPr>
+              <w:spacing w:after="0" w:line="290" w:lineRule="exact"/>
               <w:jc w:val="center"/>
             </w:pPr>
             <w:r>
@@ -261,16 +261,16 @@
               <w:right w:val="single" w:color="000000" w:sz="4"/>
             </w:tcBorders>
             <w:tcMar>
-              <w:top w:type="dxa" w:w="30"/>
-              <w:left w:type="dxa" w:w="90"/>
-              <w:bottom w:type="dxa" w:w="30"/>
-              <w:right w:type="dxa" w:w="90"/>
-            </w:tcMar>
-            <w:vAlign w:val="center"/>
-          </w:tcPr>
-          <w:p>
-            <w:pPr>
-              <w:spacing w:after="0" w:line="264"/>
+              <w:top w:type="dxa" w:w="20"/>
+              <w:left w:type="dxa" w:w="80"/>
+              <w:bottom w:type="dxa" w:w="20"/>
+              <w:right w:type="dxa" w:w="80"/>
+            </w:tcMar>
+            <w:vAlign w:val="center"/>
+          </w:tcPr>
+          <w:p>
+            <w:pPr>
+              <w:spacing w:after="0" w:line="290" w:lineRule="exact"/>
               <w:jc w:val="left"/>
             </w:pPr>
             <w:r>
@@ -301,16 +301,16 @@
               <w:right w:val="single" w:color="000000" w:sz="4"/>
             </w:tcBorders>
             <w:tcMar>
-              <w:top w:type="dxa" w:w="30"/>
-              <w:left w:type="dxa" w:w="90"/>
-              <w:bottom w:type="dxa" w:w="30"/>
-              <w:right w:type="dxa" w:w="90"/>
-            </w:tcMar>
-            <w:vAlign w:val="center"/>
-          </w:tcPr>
-          <w:p>
-            <w:pPr>
-              <w:spacing w:after="0" w:line="264"/>
+              <w:top w:type="dxa" w:w="20"/>
+              <w:left w:type="dxa" w:w="80"/>
+              <w:bottom w:type="dxa" w:w="20"/>
+              <w:right w:type="dxa" w:w="80"/>
+            </w:tcMar>
+            <w:vAlign w:val="center"/>
+          </w:tcPr>
+          <w:p>
+            <w:pPr>
+              <w:spacing w:after="0" w:line="290" w:lineRule="exact"/>
               <w:jc w:val="center"/>
             </w:pPr>
             <w:r>
@@ -335,16 +335,16 @@
               <w:right w:val="single" w:color="000000" w:sz="4"/>
             </w:tcBorders>
             <w:tcMar>
-              <w:top w:type="dxa" w:w="30"/>
-              <w:left w:type="dxa" w:w="90"/>
-              <w:bottom w:type="dxa" w:w="30"/>
-              <w:right w:type="dxa" w:w="90"/>
-            </w:tcMar>
-            <w:vAlign w:val="center"/>
-          </w:tcPr>
-          <w:p>
-            <w:pPr>
-              <w:spacing w:after="0" w:line="264"/>
+              <w:top w:type="dxa" w:w="20"/>
+              <w:left w:type="dxa" w:w="80"/>
+              <w:bottom w:type="dxa" w:w="20"/>
+              <w:right w:type="dxa" w:w="80"/>
+            </w:tcMar>
+            <w:vAlign w:val="center"/>
+          </w:tcPr>
+          <w:p>
+            <w:pPr>
+              <w:spacing w:after="0" w:line="290" w:lineRule="exact"/>
               <w:jc w:val="left"/>
             </w:pPr>
             <w:r>
@@ -375,16 +375,16 @@
               <w:right w:val="single" w:color="000000" w:sz="4"/>
             </w:tcBorders>
             <w:tcMar>
-              <w:top w:type="dxa" w:w="30"/>
-              <w:left w:type="dxa" w:w="90"/>
-              <w:bottom w:type="dxa" w:w="30"/>
-              <w:right w:type="dxa" w:w="90"/>
-            </w:tcMar>
-            <w:vAlign w:val="center"/>
-          </w:tcPr>
-          <w:p>
-            <w:pPr>
-              <w:spacing w:after="0" w:line="264"/>
+              <w:top w:type="dxa" w:w="20"/>
+              <w:left w:type="dxa" w:w="80"/>
+              <w:bottom w:type="dxa" w:w="20"/>
+              <w:right w:type="dxa" w:w="80"/>
+            </w:tcMar>
+            <w:vAlign w:val="center"/>
+          </w:tcPr>
+          <w:p>
+            <w:pPr>
+              <w:spacing w:after="0" w:line="290" w:lineRule="exact"/>
               <w:jc w:val="center"/>
             </w:pPr>
             <w:r>
@@ -409,16 +409,16 @@
               <w:right w:val="single" w:color="000000" w:sz="4"/>
             </w:tcBorders>
             <w:tcMar>
-              <w:top w:type="dxa" w:w="30"/>
-              <w:left w:type="dxa" w:w="90"/>
-              <w:bottom w:type="dxa" w:w="30"/>
-              <w:right w:type="dxa" w:w="90"/>
-            </w:tcMar>
-            <w:vAlign w:val="center"/>
-          </w:tcPr>
-          <w:p>
-            <w:pPr>
-              <w:spacing w:after="0" w:line="264"/>
+              <w:top w:type="dxa" w:w="20"/>
+              <w:left w:type="dxa" w:w="80"/>
+              <w:bottom w:type="dxa" w:w="20"/>
+              <w:right w:type="dxa" w:w="80"/>
+            </w:tcMar>
+            <w:vAlign w:val="center"/>
+          </w:tcPr>
+          <w:p>
+            <w:pPr>
+              <w:spacing w:after="0" w:line="290" w:lineRule="exact"/>
               <w:jc w:val="left"/>
             </w:pPr>
             <w:r>
@@ -438,7 +438,7 @@
     <w:p>
       <w:pPr>
         <w:keepNext/>
-        <w:spacing w:after="100" w:before="240"/>
+        <w:spacing w:after="80" w:before="200" w:line="340" w:lineRule="exact"/>
       </w:pPr>
       <w:r>
         <w:rPr>
@@ -485,16 +485,16 @@
               <w:right w:val="single" w:color="000000" w:sz="4"/>
             </w:tcBorders>
             <w:tcMar>
-              <w:top w:type="dxa" w:w="30"/>
-              <w:left w:type="dxa" w:w="90"/>
-              <w:bottom w:type="dxa" w:w="30"/>
-              <w:right w:type="dxa" w:w="90"/>
-            </w:tcMar>
-            <w:vAlign w:val="center"/>
-          </w:tcPr>
-          <w:p>
-            <w:pPr>
-              <w:spacing w:after="0" w:line="264"/>
+              <w:top w:type="dxa" w:w="20"/>
+              <w:left w:type="dxa" w:w="80"/>
+              <w:bottom w:type="dxa" w:w="20"/>
+              <w:right w:type="dxa" w:w="80"/>
+            </w:tcMar>
+            <w:vAlign w:val="center"/>
+          </w:tcPr>
+          <w:p>
+            <w:pPr>
+              <w:spacing w:after="0" w:line="290" w:lineRule="exact"/>
               <w:jc w:val="center"/>
             </w:pPr>
             <w:r>
@@ -519,16 +519,16 @@
               <w:right w:val="single" w:color="000000" w:sz="4"/>
             </w:tcBorders>
             <w:tcMar>
-              <w:top w:type="dxa" w:w="30"/>
-              <w:left w:type="dxa" w:w="90"/>
-              <w:bottom w:type="dxa" w:w="30"/>
-              <w:right w:type="dxa" w:w="90"/>
-            </w:tcMar>
-            <w:vAlign w:val="center"/>
-          </w:tcPr>
-          <w:p>
-            <w:pPr>
-              <w:spacing w:after="0" w:line="264"/>
+              <w:top w:type="dxa" w:w="20"/>
+              <w:left w:type="dxa" w:w="80"/>
+              <w:bottom w:type="dxa" w:w="20"/>
+              <w:right w:type="dxa" w:w="80"/>
+            </w:tcMar>
+            <w:vAlign w:val="center"/>
+          </w:tcPr>
+          <w:p>
+            <w:pPr>
+              <w:spacing w:after="0" w:line="290" w:lineRule="exact"/>
               <w:jc w:val="center"/>
             </w:pPr>
             <w:r>
@@ -553,16 +553,16 @@
               <w:right w:val="single" w:color="000000" w:sz="4"/>
             </w:tcBorders>
             <w:tcMar>
-              <w:top w:type="dxa" w:w="30"/>
-              <w:left w:type="dxa" w:w="90"/>
-              <w:bottom w:type="dxa" w:w="30"/>
-              <w:right w:type="dxa" w:w="90"/>
-            </w:tcMar>
-            <w:vAlign w:val="center"/>
-          </w:tcPr>
-          <w:p>
-            <w:pPr>
-              <w:spacing w:after="0" w:line="264"/>
+              <w:top w:type="dxa" w:w="20"/>
+              <w:left w:type="dxa" w:w="80"/>
+              <w:bottom w:type="dxa" w:w="20"/>
+              <w:right w:type="dxa" w:w="80"/>
+            </w:tcMar>
+            <w:vAlign w:val="center"/>
+          </w:tcPr>
+          <w:p>
+            <w:pPr>
+              <w:spacing w:after="0" w:line="290" w:lineRule="exact"/>
               <w:jc w:val="center"/>
             </w:pPr>
             <w:r>
@@ -587,16 +587,16 @@
               <w:right w:val="single" w:color="000000" w:sz="4"/>
             </w:tcBorders>
             <w:tcMar>
-              <w:top w:type="dxa" w:w="30"/>
-              <w:left w:type="dxa" w:w="90"/>
-              <w:bottom w:type="dxa" w:w="30"/>
-              <w:right w:type="dxa" w:w="90"/>
-            </w:tcMar>
-            <w:vAlign w:val="center"/>
-          </w:tcPr>
-          <w:p>
-            <w:pPr>
-              <w:spacing w:after="0" w:line="264"/>
+              <w:top w:type="dxa" w:w="20"/>
+              <w:left w:type="dxa" w:w="80"/>
+              <w:bottom w:type="dxa" w:w="20"/>
+              <w:right w:type="dxa" w:w="80"/>
+            </w:tcMar>
+            <w:vAlign w:val="center"/>
+          </w:tcPr>
+          <w:p>
+            <w:pPr>
+              <w:spacing w:after="0" w:line="290" w:lineRule="exact"/>
               <w:jc w:val="center"/>
             </w:pPr>
             <w:r>
@@ -621,16 +621,16 @@
               <w:right w:val="single" w:color="000000" w:sz="4"/>
             </w:tcBorders>
             <w:tcMar>
-              <w:top w:type="dxa" w:w="30"/>
-              <w:left w:type="dxa" w:w="90"/>
-              <w:bottom w:type="dxa" w:w="30"/>
-              <w:right w:type="dxa" w:w="90"/>
-            </w:tcMar>
-            <w:vAlign w:val="center"/>
-          </w:tcPr>
-          <w:p>
-            <w:pPr>
-              <w:spacing w:after="0" w:line="264"/>
+              <w:top w:type="dxa" w:w="20"/>
+              <w:left w:type="dxa" w:w="80"/>
+              <w:bottom w:type="dxa" w:w="20"/>
+              <w:right w:type="dxa" w:w="80"/>
+            </w:tcMar>
+            <w:vAlign w:val="center"/>
+          </w:tcPr>
+          <w:p>
+            <w:pPr>
+              <w:spacing w:after="0" w:line="290" w:lineRule="exact"/>
               <w:jc w:val="center"/>
             </w:pPr>
             <w:r>
@@ -661,16 +661,16 @@
               <w:right w:val="single" w:color="000000" w:sz="4"/>
             </w:tcBorders>
             <w:tcMar>
-              <w:top w:type="dxa" w:w="30"/>
-              <w:left w:type="dxa" w:w="90"/>
-              <w:bottom w:type="dxa" w:w="30"/>
-              <w:right w:type="dxa" w:w="90"/>
-            </w:tcMar>
-            <w:vAlign w:val="center"/>
-          </w:tcPr>
-          <w:p>
-            <w:pPr>
-              <w:spacing w:after="0" w:line="264"/>
+              <w:top w:type="dxa" w:w="20"/>
+              <w:left w:type="dxa" w:w="80"/>
+              <w:bottom w:type="dxa" w:w="20"/>
+              <w:right w:type="dxa" w:w="80"/>
+            </w:tcMar>
+            <w:vAlign w:val="center"/>
+          </w:tcPr>
+          <w:p>
+            <w:pPr>
+              <w:spacing w:after="0" w:line="290" w:lineRule="exact"/>
               <w:jc w:val="center"/>
             </w:pPr>
             <w:r>
@@ -686,7 +686,7 @@
           </w:p>
           <w:p>
             <w:pPr>
-              <w:spacing w:after="0" w:line="264"/>
+              <w:spacing w:after="0" w:line="290" w:lineRule="exact"/>
               <w:jc w:val="center"/>
             </w:pPr>
             <w:r>
@@ -711,16 +711,16 @@
               <w:right w:val="single" w:color="000000" w:sz="4"/>
             </w:tcBorders>
             <w:tcMar>
-              <w:top w:type="dxa" w:w="30"/>
-              <w:left w:type="dxa" w:w="90"/>
-              <w:bottom w:type="dxa" w:w="30"/>
-              <w:right w:type="dxa" w:w="90"/>
-            </w:tcMar>
-            <w:vAlign w:val="center"/>
-          </w:tcPr>
-          <w:p>
-            <w:pPr>
-              <w:spacing w:after="0" w:line="264"/>
+              <w:top w:type="dxa" w:w="20"/>
+              <w:left w:type="dxa" w:w="80"/>
+              <w:bottom w:type="dxa" w:w="20"/>
+              <w:right w:type="dxa" w:w="80"/>
+            </w:tcMar>
+            <w:vAlign w:val="center"/>
+          </w:tcPr>
+          <w:p>
+            <w:pPr>
+              <w:spacing w:after="0" w:line="290" w:lineRule="exact"/>
               <w:jc w:val="center"/>
             </w:pPr>
             <w:r>
@@ -736,7 +736,7 @@
           </w:p>
           <w:p>
             <w:pPr>
-              <w:spacing w:after="0" w:line="264"/>
+              <w:spacing w:after="0" w:line="290" w:lineRule="exact"/>
               <w:jc w:val="center"/>
             </w:pPr>
             <w:r>
@@ -761,16 +761,16 @@
               <w:right w:val="single" w:color="000000" w:sz="4"/>
             </w:tcBorders>
             <w:tcMar>
-              <w:top w:type="dxa" w:w="30"/>
-              <w:left w:type="dxa" w:w="90"/>
-              <w:bottom w:type="dxa" w:w="30"/>
-              <w:right w:type="dxa" w:w="90"/>
-            </w:tcMar>
-            <w:vAlign w:val="center"/>
-          </w:tcPr>
-          <w:p>
-            <w:pPr>
-              <w:spacing w:after="0" w:line="264"/>
+              <w:top w:type="dxa" w:w="20"/>
+              <w:left w:type="dxa" w:w="80"/>
+              <w:bottom w:type="dxa" w:w="20"/>
+              <w:right w:type="dxa" w:w="80"/>
+            </w:tcMar>
+            <w:vAlign w:val="center"/>
+          </w:tcPr>
+          <w:p>
+            <w:pPr>
+              <w:spacing w:after="0" w:line="290" w:lineRule="exact"/>
               <w:jc w:val="center"/>
             </w:pPr>
             <w:r>
@@ -786,7 +786,7 @@
           </w:p>
           <w:p>
             <w:pPr>
-              <w:spacing w:after="0" w:line="264"/>
+              <w:spacing w:after="0" w:line="290" w:lineRule="exact"/>
               <w:jc w:val="center"/>
             </w:pPr>
             <w:r>
@@ -811,16 +811,16 @@
               <w:right w:val="single" w:color="000000" w:sz="4"/>
             </w:tcBorders>
             <w:tcMar>
-              <w:top w:type="dxa" w:w="30"/>
-              <w:left w:type="dxa" w:w="90"/>
-              <w:bottom w:type="dxa" w:w="30"/>
-              <w:right w:type="dxa" w:w="90"/>
-            </w:tcMar>
-            <w:vAlign w:val="center"/>
-          </w:tcPr>
-          <w:p>
-            <w:pPr>
-              <w:spacing w:after="0" w:line="264"/>
+              <w:top w:type="dxa" w:w="20"/>
+              <w:left w:type="dxa" w:w="80"/>
+              <w:bottom w:type="dxa" w:w="20"/>
+              <w:right w:type="dxa" w:w="80"/>
+            </w:tcMar>
+            <w:vAlign w:val="center"/>
+          </w:tcPr>
+          <w:p>
+            <w:pPr>
+              <w:spacing w:after="0" w:line="290" w:lineRule="exact"/>
               <w:jc w:val="center"/>
             </w:pPr>
             <w:r>
@@ -845,16 +845,16 @@
               <w:right w:val="single" w:color="000000" w:sz="4"/>
             </w:tcBorders>
             <w:tcMar>
-              <w:top w:type="dxa" w:w="30"/>
-              <w:left w:type="dxa" w:w="90"/>
-              <w:bottom w:type="dxa" w:w="30"/>
-              <w:right w:type="dxa" w:w="90"/>
-            </w:tcMar>
-            <w:vAlign w:val="center"/>
-          </w:tcPr>
-          <w:p>
-            <w:pPr>
-              <w:spacing w:after="0" w:line="264"/>
+              <w:top w:type="dxa" w:w="20"/>
+              <w:left w:type="dxa" w:w="80"/>
+              <w:bottom w:type="dxa" w:w="20"/>
+              <w:right w:type="dxa" w:w="80"/>
+            </w:tcMar>
+            <w:vAlign w:val="center"/>
+          </w:tcPr>
+          <w:p>
+            <w:pPr>
+              <w:spacing w:after="0" w:line="290" w:lineRule="exact"/>
               <w:jc w:val="center"/>
             </w:pPr>
             <w:r>
@@ -874,7 +874,7 @@
     <w:p>
       <w:pPr>
         <w:keepNext/>
-        <w:spacing w:after="100" w:before="240"/>
+        <w:spacing w:after="80" w:before="200" w:line="340" w:lineRule="exact"/>
       </w:pPr>
       <w:r>
         <w:rPr>
@@ -920,16 +920,16 @@
               <w:right w:val="single" w:color="000000" w:sz="4"/>
             </w:tcBorders>
             <w:tcMar>
-              <w:top w:type="dxa" w:w="30"/>
-              <w:left w:type="dxa" w:w="90"/>
-              <w:bottom w:type="dxa" w:w="30"/>
-              <w:right w:type="dxa" w:w="90"/>
-            </w:tcMar>
-            <w:vAlign w:val="center"/>
-          </w:tcPr>
-          <w:p>
-            <w:pPr>
-              <w:spacing w:after="0" w:line="264"/>
+              <w:top w:type="dxa" w:w="20"/>
+              <w:left w:type="dxa" w:w="80"/>
+              <w:bottom w:type="dxa" w:w="20"/>
+              <w:right w:type="dxa" w:w="80"/>
+            </w:tcMar>
+            <w:vAlign w:val="center"/>
+          </w:tcPr>
+          <w:p>
+            <w:pPr>
+              <w:spacing w:after="0" w:line="290" w:lineRule="exact"/>
               <w:jc w:val="center"/>
             </w:pPr>
             <w:r>
@@ -954,16 +954,16 @@
               <w:right w:val="single" w:color="000000" w:sz="4"/>
             </w:tcBorders>
             <w:tcMar>
-              <w:top w:type="dxa" w:w="30"/>
-              <w:left w:type="dxa" w:w="90"/>
-              <w:bottom w:type="dxa" w:w="30"/>
-              <w:right w:type="dxa" w:w="90"/>
-            </w:tcMar>
-            <w:vAlign w:val="center"/>
-          </w:tcPr>
-          <w:p>
-            <w:pPr>
-              <w:spacing w:after="0" w:line="264"/>
+              <w:top w:type="dxa" w:w="20"/>
+              <w:left w:type="dxa" w:w="80"/>
+              <w:bottom w:type="dxa" w:w="20"/>
+              <w:right w:type="dxa" w:w="80"/>
+            </w:tcMar>
+            <w:vAlign w:val="center"/>
+          </w:tcPr>
+          <w:p>
+            <w:pPr>
+              <w:spacing w:after="0" w:line="290" w:lineRule="exact"/>
               <w:jc w:val="center"/>
             </w:pPr>
             <w:r>
@@ -988,16 +988,16 @@
               <w:right w:val="single" w:color="000000" w:sz="4"/>
             </w:tcBorders>
             <w:tcMar>
-              <w:top w:type="dxa" w:w="30"/>
-              <w:left w:type="dxa" w:w="90"/>
-              <w:bottom w:type="dxa" w:w="30"/>
-              <w:right w:type="dxa" w:w="90"/>
-            </w:tcMar>
-            <w:vAlign w:val="center"/>
-          </w:tcPr>
-          <w:p>
-            <w:pPr>
-              <w:spacing w:after="0" w:line="264"/>
+              <w:top w:type="dxa" w:w="20"/>
+              <w:left w:type="dxa" w:w="80"/>
+              <w:bottom w:type="dxa" w:w="20"/>
+              <w:right w:type="dxa" w:w="80"/>
+            </w:tcMar>
+            <w:vAlign w:val="center"/>
+          </w:tcPr>
+          <w:p>
+            <w:pPr>
+              <w:spacing w:after="0" w:line="290" w:lineRule="exact"/>
               <w:jc w:val="center"/>
             </w:pPr>
             <w:r>
@@ -1022,16 +1022,16 @@
               <w:right w:val="single" w:color="000000" w:sz="4"/>
             </w:tcBorders>
             <w:tcMar>
-              <w:top w:type="dxa" w:w="30"/>
-              <w:left w:type="dxa" w:w="90"/>
-              <w:bottom w:type="dxa" w:w="30"/>
-              <w:right w:type="dxa" w:w="90"/>
-            </w:tcMar>
-            <w:vAlign w:val="center"/>
-          </w:tcPr>
-          <w:p>
-            <w:pPr>
-              <w:spacing w:after="0" w:line="264"/>
+              <w:top w:type="dxa" w:w="20"/>
+              <w:left w:type="dxa" w:w="80"/>
+              <w:bottom w:type="dxa" w:w="20"/>
+              <w:right w:type="dxa" w:w="80"/>
+            </w:tcMar>
+            <w:vAlign w:val="center"/>
+          </w:tcPr>
+          <w:p>
+            <w:pPr>
+              <w:spacing w:after="0" w:line="290" w:lineRule="exact"/>
               <w:jc w:val="center"/>
             </w:pPr>
             <w:r>
@@ -1062,16 +1062,16 @@
               <w:right w:val="single" w:color="000000" w:sz="4"/>
             </w:tcBorders>
             <w:tcMar>
-              <w:top w:type="dxa" w:w="30"/>
-              <w:left w:type="dxa" w:w="90"/>
-              <w:bottom w:type="dxa" w:w="30"/>
-              <w:right w:type="dxa" w:w="90"/>
-            </w:tcMar>
-            <w:vAlign w:val="center"/>
-          </w:tcPr>
-          <w:p>
-            <w:pPr>
-              <w:spacing w:after="0" w:line="264"/>
+              <w:top w:type="dxa" w:w="20"/>
+              <w:left w:type="dxa" w:w="80"/>
+              <w:bottom w:type="dxa" w:w="20"/>
+              <w:right w:type="dxa" w:w="80"/>
+            </w:tcMar>
+            <w:vAlign w:val="center"/>
+          </w:tcPr>
+          <w:p>
+            <w:pPr>
+              <w:spacing w:after="0" w:line="290" w:lineRule="exact"/>
               <w:jc w:val="center"/>
             </w:pPr>
             <w:r>
@@ -1096,16 +1096,16 @@
               <w:right w:val="single" w:color="000000" w:sz="4"/>
             </w:tcBorders>
             <w:tcMar>
-              <w:top w:type="dxa" w:w="30"/>
-              <w:left w:type="dxa" w:w="90"/>
-              <w:bottom w:type="dxa" w:w="30"/>
-              <w:right w:type="dxa" w:w="90"/>
-            </w:tcMar>
-            <w:vAlign w:val="center"/>
-          </w:tcPr>
-          <w:p>
-            <w:pPr>
-              <w:spacing w:after="0" w:line="264"/>
+              <w:top w:type="dxa" w:w="20"/>
+              <w:left w:type="dxa" w:w="80"/>
+              <w:bottom w:type="dxa" w:w="20"/>
+              <w:right w:type="dxa" w:w="80"/>
+            </w:tcMar>
+            <w:vAlign w:val="center"/>
+          </w:tcPr>
+          <w:p>
+            <w:pPr>
+              <w:spacing w:after="0" w:line="290" w:lineRule="exact"/>
               <w:jc w:val="left"/>
             </w:pPr>
             <w:r>
@@ -1130,16 +1130,16 @@
               <w:right w:val="single" w:color="000000" w:sz="4"/>
             </w:tcBorders>
             <w:tcMar>
-              <w:top w:type="dxa" w:w="30"/>
-              <w:left w:type="dxa" w:w="90"/>
-              <w:bottom w:type="dxa" w:w="30"/>
-              <w:right w:type="dxa" w:w="90"/>
-            </w:tcMar>
-            <w:vAlign w:val="center"/>
-          </w:tcPr>
-          <w:p>
-            <w:pPr>
-              <w:spacing w:after="0" w:line="264"/>
+              <w:top w:type="dxa" w:w="20"/>
+              <w:left w:type="dxa" w:w="80"/>
+              <w:bottom w:type="dxa" w:w="20"/>
+              <w:right w:type="dxa" w:w="80"/>
+            </w:tcMar>
+            <w:vAlign w:val="center"/>
+          </w:tcPr>
+          <w:p>
+            <w:pPr>
+              <w:spacing w:after="0" w:line="290" w:lineRule="exact"/>
               <w:jc w:val="center"/>
             </w:pPr>
             <w:r>
@@ -1164,16 +1164,16 @@
               <w:right w:val="single" w:color="000000" w:sz="4"/>
             </w:tcBorders>
             <w:tcMar>
-              <w:top w:type="dxa" w:w="30"/>
-              <w:left w:type="dxa" w:w="90"/>
-              <w:bottom w:type="dxa" w:w="30"/>
-              <w:right w:type="dxa" w:w="90"/>
-            </w:tcMar>
-            <w:vAlign w:val="center"/>
-          </w:tcPr>
-          <w:p>
-            <w:pPr>
-              <w:spacing w:after="0" w:line="264"/>
+              <w:top w:type="dxa" w:w="20"/>
+              <w:left w:type="dxa" w:w="80"/>
+              <w:bottom w:type="dxa" w:w="20"/>
+              <w:right w:type="dxa" w:w="80"/>
+            </w:tcMar>
+            <w:vAlign w:val="center"/>
+          </w:tcPr>
+          <w:p>
+            <w:pPr>
+              <w:spacing w:after="0" w:line="290" w:lineRule="exact"/>
               <w:jc w:val="center"/>
             </w:pPr>
             <w:r>
@@ -1204,16 +1204,16 @@
               <w:right w:val="single" w:color="000000" w:sz="4"/>
             </w:tcBorders>
             <w:tcMar>
-              <w:top w:type="dxa" w:w="30"/>
-              <w:left w:type="dxa" w:w="90"/>
-              <w:bottom w:type="dxa" w:w="30"/>
-              <w:right w:type="dxa" w:w="90"/>
-            </w:tcMar>
-            <w:vAlign w:val="center"/>
-          </w:tcPr>
-          <w:p>
-            <w:pPr>
-              <w:spacing w:after="0" w:line="264"/>
+              <w:top w:type="dxa" w:w="20"/>
+              <w:left w:type="dxa" w:w="80"/>
+              <w:bottom w:type="dxa" w:w="20"/>
+              <w:right w:type="dxa" w:w="80"/>
+            </w:tcMar>
+            <w:vAlign w:val="center"/>
+          </w:tcPr>
+          <w:p>
+            <w:pPr>
+              <w:spacing w:after="0" w:line="290" w:lineRule="exact"/>
               <w:jc w:val="center"/>
             </w:pPr>
             <w:r>
@@ -1238,16 +1238,16 @@
               <w:right w:val="single" w:color="000000" w:sz="4"/>
             </w:tcBorders>
             <w:tcMar>
-              <w:top w:type="dxa" w:w="30"/>
-              <w:left w:type="dxa" w:w="90"/>
-              <w:bottom w:type="dxa" w:w="30"/>
-              <w:right w:type="dxa" w:w="90"/>
-            </w:tcMar>
-            <w:vAlign w:val="center"/>
-          </w:tcPr>
-          <w:p>
-            <w:pPr>
-              <w:spacing w:after="0" w:line="264"/>
+              <w:top w:type="dxa" w:w="20"/>
+              <w:left w:type="dxa" w:w="80"/>
+              <w:bottom w:type="dxa" w:w="20"/>
+              <w:right w:type="dxa" w:w="80"/>
+            </w:tcMar>
+            <w:vAlign w:val="center"/>
+          </w:tcPr>
+          <w:p>
+            <w:pPr>
+              <w:spacing w:after="0" w:line="290" w:lineRule="exact"/>
               <w:jc w:val="left"/>
             </w:pPr>
             <w:r>
@@ -1272,16 +1272,16 @@
               <w:right w:val="single" w:color="000000" w:sz="4"/>
             </w:tcBorders>
             <w:tcMar>
-              <w:top w:type="dxa" w:w="30"/>
-              <w:left w:type="dxa" w:w="90"/>
-              <w:bottom w:type="dxa" w:w="30"/>
-              <w:right w:type="dxa" w:w="90"/>
-            </w:tcMar>
-            <w:vAlign w:val="center"/>
-          </w:tcPr>
-          <w:p>
-            <w:pPr>
-              <w:spacing w:after="0" w:line="264"/>
+              <w:top w:type="dxa" w:w="20"/>
+              <w:left w:type="dxa" w:w="80"/>
+              <w:bottom w:type="dxa" w:w="20"/>
+              <w:right w:type="dxa" w:w="80"/>
+            </w:tcMar>
+            <w:vAlign w:val="center"/>
+          </w:tcPr>
+          <w:p>
+            <w:pPr>
+              <w:spacing w:after="0" w:line="290" w:lineRule="exact"/>
               <w:jc w:val="center"/>
             </w:pPr>
             <w:r>
@@ -1306,16 +1306,16 @@
               <w:right w:val="single" w:color="000000" w:sz="4"/>
             </w:tcBorders>
             <w:tcMar>
-              <w:top w:type="dxa" w:w="30"/>
-              <w:left w:type="dxa" w:w="90"/>
-              <w:bottom w:type="dxa" w:w="30"/>
-              <w:right w:type="dxa" w:w="90"/>
-            </w:tcMar>
-            <w:vAlign w:val="center"/>
-          </w:tcPr>
-          <w:p>
-            <w:pPr>
-              <w:spacing w:after="0" w:line="264"/>
+              <w:top w:type="dxa" w:w="20"/>
+              <w:left w:type="dxa" w:w="80"/>
+              <w:bottom w:type="dxa" w:w="20"/>
+              <w:right w:type="dxa" w:w="80"/>
+            </w:tcMar>
+            <w:vAlign w:val="center"/>
+          </w:tcPr>
+          <w:p>
+            <w:pPr>
+              <w:spacing w:after="0" w:line="290" w:lineRule="exact"/>
               <w:jc w:val="center"/>
             </w:pPr>
             <w:r>
@@ -1346,16 +1346,16 @@
               <w:right w:val="single" w:color="000000" w:sz="4"/>
             </w:tcBorders>
             <w:tcMar>
-              <w:top w:type="dxa" w:w="30"/>
-              <w:left w:type="dxa" w:w="90"/>
-              <w:bottom w:type="dxa" w:w="30"/>
-              <w:right w:type="dxa" w:w="90"/>
-            </w:tcMar>
-            <w:vAlign w:val="center"/>
-          </w:tcPr>
-          <w:p>
-            <w:pPr>
-              <w:spacing w:after="0" w:line="264"/>
+              <w:top w:type="dxa" w:w="20"/>
+              <w:left w:type="dxa" w:w="80"/>
+              <w:bottom w:type="dxa" w:w="20"/>
+              <w:right w:type="dxa" w:w="80"/>
+            </w:tcMar>
+            <w:vAlign w:val="center"/>
+          </w:tcPr>
+          <w:p>
+            <w:pPr>
+              <w:spacing w:after="0" w:line="290" w:lineRule="exact"/>
               <w:jc w:val="center"/>
             </w:pPr>
             <w:r>
@@ -1380,16 +1380,16 @@
               <w:right w:val="single" w:color="000000" w:sz="4"/>
             </w:tcBorders>
             <w:tcMar>
-              <w:top w:type="dxa" w:w="30"/>
-              <w:left w:type="dxa" w:w="90"/>
-              <w:bottom w:type="dxa" w:w="30"/>
-              <w:right w:type="dxa" w:w="90"/>
-            </w:tcMar>
-            <w:vAlign w:val="center"/>
-          </w:tcPr>
-          <w:p>
-            <w:pPr>
-              <w:spacing w:after="0" w:line="264"/>
+              <w:top w:type="dxa" w:w="20"/>
+              <w:left w:type="dxa" w:w="80"/>
+              <w:bottom w:type="dxa" w:w="20"/>
+              <w:right w:type="dxa" w:w="80"/>
+            </w:tcMar>
+            <w:vAlign w:val="center"/>
+          </w:tcPr>
+          <w:p>
+            <w:pPr>
+              <w:spacing w:after="0" w:line="290" w:lineRule="exact"/>
               <w:jc w:val="left"/>
             </w:pPr>
             <w:r>
@@ -1414,16 +1414,16 @@
               <w:right w:val="single" w:color="000000" w:sz="4"/>
             </w:tcBorders>
             <w:tcMar>
-              <w:top w:type="dxa" w:w="30"/>
-              <w:left w:type="dxa" w:w="90"/>
-              <w:bottom w:type="dxa" w:w="30"/>
-              <w:right w:type="dxa" w:w="90"/>
-            </w:tcMar>
-            <w:vAlign w:val="center"/>
-          </w:tcPr>
-          <w:p>
-            <w:pPr>
-              <w:spacing w:after="0" w:line="264"/>
+              <w:top w:type="dxa" w:w="20"/>
+              <w:left w:type="dxa" w:w="80"/>
+              <w:bottom w:type="dxa" w:w="20"/>
+              <w:right w:type="dxa" w:w="80"/>
+            </w:tcMar>
+            <w:vAlign w:val="center"/>
+          </w:tcPr>
+          <w:p>
+            <w:pPr>
+              <w:spacing w:after="0" w:line="290" w:lineRule="exact"/>
               <w:jc w:val="center"/>
             </w:pPr>
             <w:r>
@@ -1448,16 +1448,16 @@
               <w:right w:val="single" w:color="000000" w:sz="4"/>
             </w:tcBorders>
             <w:tcMar>
-              <w:top w:type="dxa" w:w="30"/>
-              <w:left w:type="dxa" w:w="90"/>
-              <w:bottom w:type="dxa" w:w="30"/>
-              <w:right w:type="dxa" w:w="90"/>
-            </w:tcMar>
-            <w:vAlign w:val="center"/>
-          </w:tcPr>
-          <w:p>
-            <w:pPr>
-              <w:spacing w:after="0" w:line="264"/>
+              <w:top w:type="dxa" w:w="20"/>
+              <w:left w:type="dxa" w:w="80"/>
+              <w:bottom w:type="dxa" w:w="20"/>
+              <w:right w:type="dxa" w:w="80"/>
+            </w:tcMar>
+            <w:vAlign w:val="center"/>
+          </w:tcPr>
+          <w:p>
+            <w:pPr>
+              <w:spacing w:after="0" w:line="290" w:lineRule="exact"/>
               <w:jc w:val="center"/>
             </w:pPr>
             <w:r>
@@ -1488,16 +1488,16 @@
               <w:right w:val="single" w:color="000000" w:sz="4"/>
             </w:tcBorders>
             <w:tcMar>
-              <w:top w:type="dxa" w:w="30"/>
-              <w:left w:type="dxa" w:w="90"/>
-              <w:bottom w:type="dxa" w:w="30"/>
-              <w:right w:type="dxa" w:w="90"/>
-            </w:tcMar>
-            <w:vAlign w:val="center"/>
-          </w:tcPr>
-          <w:p>
-            <w:pPr>
-              <w:spacing w:after="0" w:line="264"/>
+              <w:top w:type="dxa" w:w="20"/>
+              <w:left w:type="dxa" w:w="80"/>
+              <w:bottom w:type="dxa" w:w="20"/>
+              <w:right w:type="dxa" w:w="80"/>
+            </w:tcMar>
+            <w:vAlign w:val="center"/>
+          </w:tcPr>
+          <w:p>
+            <w:pPr>
+              <w:spacing w:after="0" w:line="290" w:lineRule="exact"/>
               <w:jc w:val="center"/>
             </w:pPr>
             <w:r>
@@ -1522,16 +1522,16 @@
               <w:right w:val="single" w:color="000000" w:sz="4"/>
             </w:tcBorders>
             <w:tcMar>
-              <w:top w:type="dxa" w:w="30"/>
-              <w:left w:type="dxa" w:w="90"/>
-              <w:bottom w:type="dxa" w:w="30"/>
-              <w:right w:type="dxa" w:w="90"/>
-            </w:tcMar>
-            <w:vAlign w:val="center"/>
-          </w:tcPr>
-          <w:p>
-            <w:pPr>
-              <w:spacing w:after="0" w:line="264"/>
+              <w:top w:type="dxa" w:w="20"/>
+              <w:left w:type="dxa" w:w="80"/>
+              <w:bottom w:type="dxa" w:w="20"/>
+              <w:right w:type="dxa" w:w="80"/>
+            </w:tcMar>
+            <w:vAlign w:val="center"/>
+          </w:tcPr>
+          <w:p>
+            <w:pPr>
+              <w:spacing w:after="0" w:line="290" w:lineRule="exact"/>
               <w:jc w:val="left"/>
             </w:pPr>
             <w:r>
@@ -1556,16 +1556,16 @@
               <w:right w:val="single" w:color="000000" w:sz="4"/>
             </w:tcBorders>
             <w:tcMar>
-              <w:top w:type="dxa" w:w="30"/>
-              <w:left w:type="dxa" w:w="90"/>
-              <w:bottom w:type="dxa" w:w="30"/>
-              <w:right w:type="dxa" w:w="90"/>
-            </w:tcMar>
-            <w:vAlign w:val="center"/>
-          </w:tcPr>
-          <w:p>
-            <w:pPr>
-              <w:spacing w:after="0" w:line="264"/>
+              <w:top w:type="dxa" w:w="20"/>
+              <w:left w:type="dxa" w:w="80"/>
+              <w:bottom w:type="dxa" w:w="20"/>
+              <w:right w:type="dxa" w:w="80"/>
+            </w:tcMar>
+            <w:vAlign w:val="center"/>
+          </w:tcPr>
+          <w:p>
+            <w:pPr>
+              <w:spacing w:after="0" w:line="290" w:lineRule="exact"/>
               <w:jc w:val="center"/>
             </w:pPr>
             <w:r>
@@ -1590,16 +1590,16 @@
               <w:right w:val="single" w:color="000000" w:sz="4"/>
             </w:tcBorders>
             <w:tcMar>
-              <w:top w:type="dxa" w:w="30"/>
-              <w:left w:type="dxa" w:w="90"/>
-              <w:bottom w:type="dxa" w:w="30"/>
-              <w:right w:type="dxa" w:w="90"/>
-            </w:tcMar>
-            <w:vAlign w:val="center"/>
-          </w:tcPr>
-          <w:p>
-            <w:pPr>
-              <w:spacing w:after="0" w:line="264"/>
+              <w:top w:type="dxa" w:w="20"/>
+              <w:left w:type="dxa" w:w="80"/>
+              <w:bottom w:type="dxa" w:w="20"/>
+              <w:right w:type="dxa" w:w="80"/>
+            </w:tcMar>
+            <w:vAlign w:val="center"/>
+          </w:tcPr>
+          <w:p>
+            <w:pPr>
+              <w:spacing w:after="0" w:line="290" w:lineRule="exact"/>
               <w:jc w:val="center"/>
             </w:pPr>
             <w:r>
@@ -1630,16 +1630,16 @@
               <w:right w:val="single" w:color="000000" w:sz="4"/>
             </w:tcBorders>
             <w:tcMar>
-              <w:top w:type="dxa" w:w="30"/>
-              <w:left w:type="dxa" w:w="90"/>
-              <w:bottom w:type="dxa" w:w="30"/>
-              <w:right w:type="dxa" w:w="90"/>
-            </w:tcMar>
-            <w:vAlign w:val="center"/>
-          </w:tcPr>
-          <w:p>
-            <w:pPr>
-              <w:spacing w:after="0" w:line="264"/>
+              <w:top w:type="dxa" w:w="20"/>
+              <w:left w:type="dxa" w:w="80"/>
+              <w:bottom w:type="dxa" w:w="20"/>
+              <w:right w:type="dxa" w:w="80"/>
+            </w:tcMar>
+            <w:vAlign w:val="center"/>
+          </w:tcPr>
+          <w:p>
+            <w:pPr>
+              <w:spacing w:after="0" w:line="290" w:lineRule="exact"/>
               <w:jc w:val="center"/>
             </w:pPr>
             <w:r>
@@ -1664,16 +1664,16 @@
               <w:right w:val="single" w:color="000000" w:sz="4"/>
             </w:tcBorders>
             <w:tcMar>
-              <w:top w:type="dxa" w:w="30"/>
-              <w:left w:type="dxa" w:w="90"/>
-              <w:bottom w:type="dxa" w:w="30"/>
-              <w:right w:type="dxa" w:w="90"/>
-            </w:tcMar>
-            <w:vAlign w:val="center"/>
-          </w:tcPr>
-          <w:p>
-            <w:pPr>
-              <w:spacing w:after="0" w:line="264"/>
+              <w:top w:type="dxa" w:w="20"/>
+              <w:left w:type="dxa" w:w="80"/>
+              <w:bottom w:type="dxa" w:w="20"/>
+              <w:right w:type="dxa" w:w="80"/>
+            </w:tcMar>
+            <w:vAlign w:val="center"/>
+          </w:tcPr>
+          <w:p>
+            <w:pPr>
+              <w:spacing w:after="0" w:line="290" w:lineRule="exact"/>
               <w:jc w:val="left"/>
             </w:pPr>
             <w:r>
@@ -1698,16 +1698,16 @@
               <w:right w:val="single" w:color="000000" w:sz="4"/>
             </w:tcBorders>
             <w:tcMar>
-              <w:top w:type="dxa" w:w="30"/>
-              <w:left w:type="dxa" w:w="90"/>
-              <w:bottom w:type="dxa" w:w="30"/>
-              <w:right w:type="dxa" w:w="90"/>
-            </w:tcMar>
-            <w:vAlign w:val="center"/>
-          </w:tcPr>
-          <w:p>
-            <w:pPr>
-              <w:spacing w:after="0" w:line="264"/>
+              <w:top w:type="dxa" w:w="20"/>
+              <w:left w:type="dxa" w:w="80"/>
+              <w:bottom w:type="dxa" w:w="20"/>
+              <w:right w:type="dxa" w:w="80"/>
+            </w:tcMar>
+            <w:vAlign w:val="center"/>
+          </w:tcPr>
+          <w:p>
+            <w:pPr>
+              <w:spacing w:after="0" w:line="290" w:lineRule="exact"/>
               <w:jc w:val="center"/>
             </w:pPr>
             <w:r>
@@ -1732,16 +1732,16 @@
               <w:right w:val="single" w:color="000000" w:sz="4"/>
             </w:tcBorders>
             <w:tcMar>
-              <w:top w:type="dxa" w:w="30"/>
-              <w:left w:type="dxa" w:w="90"/>
-              <w:bottom w:type="dxa" w:w="30"/>
-              <w:right w:type="dxa" w:w="90"/>
-            </w:tcMar>
-            <w:vAlign w:val="center"/>
-          </w:tcPr>
-          <w:p>
-            <w:pPr>
-              <w:spacing w:after="0" w:line="264"/>
+              <w:top w:type="dxa" w:w="20"/>
+              <w:left w:type="dxa" w:w="80"/>
+              <w:bottom w:type="dxa" w:w="20"/>
+              <w:right w:type="dxa" w:w="80"/>
+            </w:tcMar>
+            <w:vAlign w:val="center"/>
+          </w:tcPr>
+          <w:p>
+            <w:pPr>
+              <w:spacing w:after="0" w:line="290" w:lineRule="exact"/>
               <w:jc w:val="center"/>
             </w:pPr>
             <w:r>
@@ -1772,16 +1772,16 @@
               <w:right w:val="single" w:color="000000" w:sz="4"/>
             </w:tcBorders>
             <w:tcMar>
-              <w:top w:type="dxa" w:w="30"/>
-              <w:left w:type="dxa" w:w="90"/>
-              <w:bottom w:type="dxa" w:w="30"/>
-              <w:right w:type="dxa" w:w="90"/>
-            </w:tcMar>
-            <w:vAlign w:val="center"/>
-          </w:tcPr>
-          <w:p>
-            <w:pPr>
-              <w:spacing w:after="0" w:line="264"/>
+              <w:top w:type="dxa" w:w="20"/>
+              <w:left w:type="dxa" w:w="80"/>
+              <w:bottom w:type="dxa" w:w="20"/>
+              <w:right w:type="dxa" w:w="80"/>
+            </w:tcMar>
+            <w:vAlign w:val="center"/>
+          </w:tcPr>
+          <w:p>
+            <w:pPr>
+              <w:spacing w:after="0" w:line="290" w:lineRule="exact"/>
               <w:jc w:val="center"/>
             </w:pPr>
             <w:r>
@@ -1806,16 +1806,16 @@
               <w:right w:val="single" w:color="000000" w:sz="4"/>
             </w:tcBorders>
             <w:tcMar>
-              <w:top w:type="dxa" w:w="30"/>
-              <w:left w:type="dxa" w:w="90"/>
-              <w:bottom w:type="dxa" w:w="30"/>
-              <w:right w:type="dxa" w:w="90"/>
-            </w:tcMar>
-            <w:vAlign w:val="center"/>
-          </w:tcPr>
-          <w:p>
-            <w:pPr>
-              <w:spacing w:after="0" w:line="264"/>
+              <w:top w:type="dxa" w:w="20"/>
+              <w:left w:type="dxa" w:w="80"/>
+              <w:bottom w:type="dxa" w:w="20"/>
+              <w:right w:type="dxa" w:w="80"/>
+            </w:tcMar>
+            <w:vAlign w:val="center"/>
+          </w:tcPr>
+          <w:p>
+            <w:pPr>
+              <w:spacing w:after="0" w:line="290" w:lineRule="exact"/>
               <w:jc w:val="left"/>
             </w:pPr>
             <w:r>
@@ -1840,16 +1840,16 @@
               <w:right w:val="single" w:color="000000" w:sz="4"/>
             </w:tcBorders>
             <w:tcMar>
-              <w:top w:type="dxa" w:w="30"/>
-              <w:left w:type="dxa" w:w="90"/>
-              <w:bottom w:type="dxa" w:w="30"/>
-              <w:right w:type="dxa" w:w="90"/>
-            </w:tcMar>
-            <w:vAlign w:val="center"/>
-          </w:tcPr>
-          <w:p>
-            <w:pPr>
-              <w:spacing w:after="0" w:line="264"/>
+              <w:top w:type="dxa" w:w="20"/>
+              <w:left w:type="dxa" w:w="80"/>
+              <w:bottom w:type="dxa" w:w="20"/>
+              <w:right w:type="dxa" w:w="80"/>
+            </w:tcMar>
+            <w:vAlign w:val="center"/>
+          </w:tcPr>
+          <w:p>
+            <w:pPr>
+              <w:spacing w:after="0" w:line="290" w:lineRule="exact"/>
               <w:jc w:val="center"/>
             </w:pPr>
             <w:r>
@@ -1874,16 +1874,16 @@
               <w:right w:val="single" w:color="000000" w:sz="4"/>
             </w:tcBorders>
             <w:tcMar>
-              <w:top w:type="dxa" w:w="30"/>
-              <w:left w:type="dxa" w:w="90"/>
-              <w:bottom w:type="dxa" w:w="30"/>
-              <w:right w:type="dxa" w:w="90"/>
-            </w:tcMar>
-            <w:vAlign w:val="center"/>
-          </w:tcPr>
-          <w:p>
-            <w:pPr>
-              <w:spacing w:after="0" w:line="264"/>
+              <w:top w:type="dxa" w:w="20"/>
+              <w:left w:type="dxa" w:w="80"/>
+              <w:bottom w:type="dxa" w:w="20"/>
+              <w:right w:type="dxa" w:w="80"/>
+            </w:tcMar>
+            <w:vAlign w:val="center"/>
+          </w:tcPr>
+          <w:p>
+            <w:pPr>
+              <w:spacing w:after="0" w:line="290" w:lineRule="exact"/>
               <w:jc w:val="center"/>
             </w:pPr>
             <w:r>
@@ -1914,16 +1914,16 @@
               <w:right w:val="single" w:color="000000" w:sz="4"/>
             </w:tcBorders>
             <w:tcMar>
-              <w:top w:type="dxa" w:w="30"/>
-              <w:left w:type="dxa" w:w="90"/>
-              <w:bottom w:type="dxa" w:w="30"/>
-              <w:right w:type="dxa" w:w="90"/>
-            </w:tcMar>
-            <w:vAlign w:val="center"/>
-          </w:tcPr>
-          <w:p>
-            <w:pPr>
-              <w:spacing w:after="0" w:line="264"/>
+              <w:top w:type="dxa" w:w="20"/>
+              <w:left w:type="dxa" w:w="80"/>
+              <w:bottom w:type="dxa" w:w="20"/>
+              <w:right w:type="dxa" w:w="80"/>
+            </w:tcMar>
+            <w:vAlign w:val="center"/>
+          </w:tcPr>
+          <w:p>
+            <w:pPr>
+              <w:spacing w:after="0" w:line="290" w:lineRule="exact"/>
               <w:jc w:val="center"/>
             </w:pPr>
             <w:r>
@@ -1948,16 +1948,16 @@
               <w:right w:val="single" w:color="000000" w:sz="4"/>
             </w:tcBorders>
             <w:tcMar>
-              <w:top w:type="dxa" w:w="30"/>
-              <w:left w:type="dxa" w:w="90"/>
-              <w:bottom w:type="dxa" w:w="30"/>
-              <w:right w:type="dxa" w:w="90"/>
-            </w:tcMar>
-            <w:vAlign w:val="center"/>
-          </w:tcPr>
-          <w:p>
-            <w:pPr>
-              <w:spacing w:after="0" w:line="264"/>
+              <w:top w:type="dxa" w:w="20"/>
+              <w:left w:type="dxa" w:w="80"/>
+              <w:bottom w:type="dxa" w:w="20"/>
+              <w:right w:type="dxa" w:w="80"/>
+            </w:tcMar>
+            <w:vAlign w:val="center"/>
+          </w:tcPr>
+          <w:p>
+            <w:pPr>
+              <w:spacing w:after="0" w:line="290" w:lineRule="exact"/>
               <w:jc w:val="left"/>
             </w:pPr>
             <w:r>
@@ -1982,16 +1982,16 @@
               <w:right w:val="single" w:color="000000" w:sz="4"/>
             </w:tcBorders>
             <w:tcMar>
-              <w:top w:type="dxa" w:w="30"/>
-              <w:left w:type="dxa" w:w="90"/>
-              <w:bottom w:type="dxa" w:w="30"/>
-              <w:right w:type="dxa" w:w="90"/>
-            </w:tcMar>
-            <w:vAlign w:val="center"/>
-          </w:tcPr>
-          <w:p>
-            <w:pPr>
-              <w:spacing w:after="0" w:line="264"/>
+              <w:top w:type="dxa" w:w="20"/>
+              <w:left w:type="dxa" w:w="80"/>
+              <w:bottom w:type="dxa" w:w="20"/>
+              <w:right w:type="dxa" w:w="80"/>
+            </w:tcMar>
+            <w:vAlign w:val="center"/>
+          </w:tcPr>
+          <w:p>
+            <w:pPr>
+              <w:spacing w:after="0" w:line="290" w:lineRule="exact"/>
               <w:jc w:val="center"/>
             </w:pPr>
             <w:r>
@@ -2016,16 +2016,16 @@
               <w:right w:val="single" w:color="000000" w:sz="4"/>
             </w:tcBorders>
             <w:tcMar>
-              <w:top w:type="dxa" w:w="30"/>
-              <w:left w:type="dxa" w:w="90"/>
-              <w:bottom w:type="dxa" w:w="30"/>
-              <w:right w:type="dxa" w:w="90"/>
-            </w:tcMar>
-            <w:vAlign w:val="center"/>
-          </w:tcPr>
-          <w:p>
-            <w:pPr>
-              <w:spacing w:after="0" w:line="264"/>
+              <w:top w:type="dxa" w:w="20"/>
+              <w:left w:type="dxa" w:w="80"/>
+              <w:bottom w:type="dxa" w:w="20"/>
+              <w:right w:type="dxa" w:w="80"/>
+            </w:tcMar>
+            <w:vAlign w:val="center"/>
+          </w:tcPr>
+          <w:p>
+            <w:pPr>
+              <w:spacing w:after="0" w:line="290" w:lineRule="exact"/>
               <w:jc w:val="center"/>
             </w:pPr>
             <w:r>
@@ -2056,16 +2056,16 @@
               <w:right w:val="single" w:color="000000" w:sz="4"/>
             </w:tcBorders>
             <w:tcMar>
-              <w:top w:type="dxa" w:w="30"/>
-              <w:left w:type="dxa" w:w="90"/>
-              <w:bottom w:type="dxa" w:w="30"/>
-              <w:right w:type="dxa" w:w="90"/>
-            </w:tcMar>
-            <w:vAlign w:val="center"/>
-          </w:tcPr>
-          <w:p>
-            <w:pPr>
-              <w:spacing w:after="0" w:line="264"/>
+              <w:top w:type="dxa" w:w="20"/>
+              <w:left w:type="dxa" w:w="80"/>
+              <w:bottom w:type="dxa" w:w="20"/>
+              <w:right w:type="dxa" w:w="80"/>
+            </w:tcMar>
+            <w:vAlign w:val="center"/>
+          </w:tcPr>
+          <w:p>
+            <w:pPr>
+              <w:spacing w:after="0" w:line="290" w:lineRule="exact"/>
               <w:jc w:val="center"/>
             </w:pPr>
             <w:r>
@@ -2090,16 +2090,16 @@
               <w:right w:val="single" w:color="000000" w:sz="4"/>
             </w:tcBorders>
             <w:tcMar>
-              <w:top w:type="dxa" w:w="30"/>
-              <w:left w:type="dxa" w:w="90"/>
-              <w:bottom w:type="dxa" w:w="30"/>
-              <w:right w:type="dxa" w:w="90"/>
-            </w:tcMar>
-            <w:vAlign w:val="center"/>
-          </w:tcPr>
-          <w:p>
-            <w:pPr>
-              <w:spacing w:after="0" w:line="264"/>
+              <w:top w:type="dxa" w:w="20"/>
+              <w:left w:type="dxa" w:w="80"/>
+              <w:bottom w:type="dxa" w:w="20"/>
+              <w:right w:type="dxa" w:w="80"/>
+            </w:tcMar>
+            <w:vAlign w:val="center"/>
+          </w:tcPr>
+          <w:p>
+            <w:pPr>
+              <w:spacing w:after="0" w:line="290" w:lineRule="exact"/>
               <w:jc w:val="left"/>
             </w:pPr>
             <w:r>
@@ -2124,16 +2124,16 @@
               <w:right w:val="single" w:color="000000" w:sz="4"/>
             </w:tcBorders>
             <w:tcMar>
-              <w:top w:type="dxa" w:w="30"/>
-              <w:left w:type="dxa" w:w="90"/>
-              <w:bottom w:type="dxa" w:w="30"/>
-              <w:right w:type="dxa" w:w="90"/>
-            </w:tcMar>
-            <w:vAlign w:val="center"/>
-          </w:tcPr>
-          <w:p>
-            <w:pPr>
-              <w:spacing w:after="0" w:line="264"/>
+              <w:top w:type="dxa" w:w="20"/>
+              <w:left w:type="dxa" w:w="80"/>
+              <w:bottom w:type="dxa" w:w="20"/>
+              <w:right w:type="dxa" w:w="80"/>
+            </w:tcMar>
+            <w:vAlign w:val="center"/>
+          </w:tcPr>
+          <w:p>
+            <w:pPr>
+              <w:spacing w:after="0" w:line="290" w:lineRule="exact"/>
               <w:jc w:val="center"/>
             </w:pPr>
             <w:r>
@@ -2158,16 +2158,16 @@
               <w:right w:val="single" w:color="000000" w:sz="4"/>
             </w:tcBorders>
             <w:tcMar>
-              <w:top w:type="dxa" w:w="30"/>
-              <w:left w:type="dxa" w:w="90"/>
-              <w:bottom w:type="dxa" w:w="30"/>
-              <w:right w:type="dxa" w:w="90"/>
-            </w:tcMar>
-            <w:vAlign w:val="center"/>
-          </w:tcPr>
-          <w:p>
-            <w:pPr>
-              <w:spacing w:after="0" w:line="264"/>
+              <w:top w:type="dxa" w:w="20"/>
+              <w:left w:type="dxa" w:w="80"/>
+              <w:bottom w:type="dxa" w:w="20"/>
+              <w:right w:type="dxa" w:w="80"/>
+            </w:tcMar>
+            <w:vAlign w:val="center"/>
+          </w:tcPr>
+          <w:p>
+            <w:pPr>
+              <w:spacing w:after="0" w:line="290" w:lineRule="exact"/>
               <w:jc w:val="center"/>
             </w:pPr>
             <w:r>
@@ -2187,7 +2187,7 @@
     <w:p>
       <w:pPr>
         <w:keepNext/>
-        <w:spacing w:after="100" w:before="240"/>
+        <w:spacing w:after="80" w:before="200" w:line="340" w:lineRule="exact"/>
       </w:pPr>
       <w:r>
         <w:rPr>
@@ -2233,16 +2233,16 @@
               <w:right w:val="single" w:color="000000" w:sz="4"/>
             </w:tcBorders>
             <w:tcMar>
-              <w:top w:type="dxa" w:w="30"/>
-              <w:left w:type="dxa" w:w="90"/>
-              <w:bottom w:type="dxa" w:w="30"/>
-              <w:right w:type="dxa" w:w="90"/>
-            </w:tcMar>
-            <w:vAlign w:val="center"/>
-          </w:tcPr>
-          <w:p>
-            <w:pPr>
-              <w:spacing w:after="0" w:line="264"/>
+              <w:top w:type="dxa" w:w="20"/>
+              <w:left w:type="dxa" w:w="80"/>
+              <w:bottom w:type="dxa" w:w="20"/>
+              <w:right w:type="dxa" w:w="80"/>
+            </w:tcMar>
+            <w:vAlign w:val="center"/>
+          </w:tcPr>
+          <w:p>
+            <w:pPr>
+              <w:spacing w:after="0" w:line="290" w:lineRule="exact"/>
               <w:jc w:val="center"/>
             </w:pPr>
             <w:r>
@@ -2267,16 +2267,16 @@
               <w:right w:val="single" w:color="000000" w:sz="4"/>
             </w:tcBorders>
             <w:tcMar>
-              <w:top w:type="dxa" w:w="30"/>
-              <w:left w:type="dxa" w:w="90"/>
-              <w:bottom w:type="dxa" w:w="30"/>
-              <w:right w:type="dxa" w:w="90"/>
-            </w:tcMar>
-            <w:vAlign w:val="center"/>
-          </w:tcPr>
-          <w:p>
-            <w:pPr>
-              <w:spacing w:after="0" w:line="264"/>
+              <w:top w:type="dxa" w:w="20"/>
+              <w:left w:type="dxa" w:w="80"/>
+              <w:bottom w:type="dxa" w:w="20"/>
+              <w:right w:type="dxa" w:w="80"/>
+            </w:tcMar>
+            <w:vAlign w:val="center"/>
+          </w:tcPr>
+          <w:p>
+            <w:pPr>
+              <w:spacing w:after="0" w:line="290" w:lineRule="exact"/>
               <w:jc w:val="center"/>
             </w:pPr>
             <w:r>
@@ -2301,16 +2301,16 @@
               <w:right w:val="single" w:color="000000" w:sz="4"/>
             </w:tcBorders>
             <w:tcMar>
-              <w:top w:type="dxa" w:w="30"/>
-              <w:left w:type="dxa" w:w="90"/>
-              <w:bottom w:type="dxa" w:w="30"/>
-              <w:right w:type="dxa" w:w="90"/>
-            </w:tcMar>
-            <w:vAlign w:val="center"/>
-          </w:tcPr>
-          <w:p>
-            <w:pPr>
-              <w:spacing w:after="0" w:line="264"/>
+              <w:top w:type="dxa" w:w="20"/>
+              <w:left w:type="dxa" w:w="80"/>
+              <w:bottom w:type="dxa" w:w="20"/>
+              <w:right w:type="dxa" w:w="80"/>
+            </w:tcMar>
+            <w:vAlign w:val="center"/>
+          </w:tcPr>
+          <w:p>
+            <w:pPr>
+              <w:spacing w:after="0" w:line="290" w:lineRule="exact"/>
               <w:jc w:val="center"/>
             </w:pPr>
             <w:r>
@@ -2335,16 +2335,16 @@
               <w:right w:val="single" w:color="000000" w:sz="4"/>
             </w:tcBorders>
             <w:tcMar>
-              <w:top w:type="dxa" w:w="30"/>
-              <w:left w:type="dxa" w:w="90"/>
-              <w:bottom w:type="dxa" w:w="30"/>
-              <w:right w:type="dxa" w:w="90"/>
-            </w:tcMar>
-            <w:vAlign w:val="center"/>
-          </w:tcPr>
-          <w:p>
-            <w:pPr>
-              <w:spacing w:after="0" w:line="264"/>
+              <w:top w:type="dxa" w:w="20"/>
+              <w:left w:type="dxa" w:w="80"/>
+              <w:bottom w:type="dxa" w:w="20"/>
+              <w:right w:type="dxa" w:w="80"/>
+            </w:tcMar>
+            <w:vAlign w:val="center"/>
+          </w:tcPr>
+          <w:p>
+            <w:pPr>
+              <w:spacing w:after="0" w:line="290" w:lineRule="exact"/>
               <w:jc w:val="center"/>
             </w:pPr>
             <w:r>
@@ -2375,16 +2375,16 @@
               <w:right w:val="single" w:color="000000" w:sz="4"/>
             </w:tcBorders>
             <w:tcMar>
-              <w:top w:type="dxa" w:w="30"/>
-              <w:left w:type="dxa" w:w="90"/>
-              <w:bottom w:type="dxa" w:w="30"/>
-              <w:right w:type="dxa" w:w="90"/>
-            </w:tcMar>
-            <w:vAlign w:val="center"/>
-          </w:tcPr>
-          <w:p>
-            <w:pPr>
-              <w:spacing w:after="0" w:line="264"/>
+              <w:top w:type="dxa" w:w="20"/>
+              <w:left w:type="dxa" w:w="80"/>
+              <w:bottom w:type="dxa" w:w="20"/>
+              <w:right w:type="dxa" w:w="80"/>
+            </w:tcMar>
+            <w:vAlign w:val="center"/>
+          </w:tcPr>
+          <w:p>
+            <w:pPr>
+              <w:spacing w:after="0" w:line="290" w:lineRule="exact"/>
               <w:jc w:val="center"/>
             </w:pPr>
             <w:r>
@@ -2409,16 +2409,16 @@
               <w:right w:val="single" w:color="000000" w:sz="4"/>
             </w:tcBorders>
             <w:tcMar>
-              <w:top w:type="dxa" w:w="30"/>
-              <w:left w:type="dxa" w:w="90"/>
-              <w:bottom w:type="dxa" w:w="30"/>
-              <w:right w:type="dxa" w:w="90"/>
-            </w:tcMar>
-            <w:vAlign w:val="center"/>
-          </w:tcPr>
-          <w:p>
-            <w:pPr>
-              <w:spacing w:after="0" w:line="264"/>
+              <w:top w:type="dxa" w:w="20"/>
+              <w:left w:type="dxa" w:w="80"/>
+              <w:bottom w:type="dxa" w:w="20"/>
+              <w:right w:type="dxa" w:w="80"/>
+            </w:tcMar>
+            <w:vAlign w:val="center"/>
+          </w:tcPr>
+          <w:p>
+            <w:pPr>
+              <w:spacing w:after="0" w:line="290" w:lineRule="exact"/>
               <w:jc w:val="left"/>
             </w:pPr>
             <w:r>
@@ -2443,16 +2443,16 @@
               <w:right w:val="single" w:color="000000" w:sz="4"/>
             </w:tcBorders>
             <w:tcMar>
-              <w:top w:type="dxa" w:w="30"/>
-              <w:left w:type="dxa" w:w="90"/>
-              <w:bottom w:type="dxa" w:w="30"/>
-              <w:right w:type="dxa" w:w="90"/>
-            </w:tcMar>
-            <w:vAlign w:val="center"/>
-          </w:tcPr>
-          <w:p>
-            <w:pPr>
-              <w:spacing w:after="0" w:line="264"/>
+              <w:top w:type="dxa" w:w="20"/>
+              <w:left w:type="dxa" w:w="80"/>
+              <w:bottom w:type="dxa" w:w="20"/>
+              <w:right w:type="dxa" w:w="80"/>
+            </w:tcMar>
+            <w:vAlign w:val="center"/>
+          </w:tcPr>
+          <w:p>
+            <w:pPr>
+              <w:spacing w:after="0" w:line="290" w:lineRule="exact"/>
               <w:jc w:val="left"/>
             </w:pPr>
             <w:r>
@@ -2477,16 +2477,16 @@
               <w:right w:val="single" w:color="000000" w:sz="4"/>
             </w:tcBorders>
             <w:tcMar>
-              <w:top w:type="dxa" w:w="30"/>
-              <w:left w:type="dxa" w:w="90"/>
-              <w:bottom w:type="dxa" w:w="30"/>
-              <w:right w:type="dxa" w:w="90"/>
-            </w:tcMar>
-            <w:vAlign w:val="center"/>
-          </w:tcPr>
-          <w:p>
-            <w:pPr>
-              <w:spacing w:after="0" w:line="264"/>
+              <w:top w:type="dxa" w:w="20"/>
+              <w:left w:type="dxa" w:w="80"/>
+              <w:bottom w:type="dxa" w:w="20"/>
+              <w:right w:type="dxa" w:w="80"/>
+            </w:tcMar>
+            <w:vAlign w:val="center"/>
+          </w:tcPr>
+          <w:p>
+            <w:pPr>
+              <w:spacing w:after="0" w:line="290" w:lineRule="exact"/>
               <w:jc w:val="center"/>
             </w:pPr>
             <w:r>
@@ -2517,16 +2517,16 @@
               <w:right w:val="single" w:color="000000" w:sz="4"/>
             </w:tcBorders>
             <w:tcMar>
-              <w:top w:type="dxa" w:w="30"/>
-              <w:left w:type="dxa" w:w="90"/>
-              <w:bottom w:type="dxa" w:w="30"/>
-              <w:right w:type="dxa" w:w="90"/>
-            </w:tcMar>
-            <w:vAlign w:val="center"/>
-          </w:tcPr>
-          <w:p>
-            <w:pPr>
-              <w:spacing w:after="0" w:line="264"/>
+              <w:top w:type="dxa" w:w="20"/>
+              <w:left w:type="dxa" w:w="80"/>
+              <w:bottom w:type="dxa" w:w="20"/>
+              <w:right w:type="dxa" w:w="80"/>
+            </w:tcMar>
+            <w:vAlign w:val="center"/>
+          </w:tcPr>
+          <w:p>
+            <w:pPr>
+              <w:spacing w:after="0" w:line="290" w:lineRule="exact"/>
               <w:jc w:val="center"/>
             </w:pPr>
             <w:r>
@@ -2542,7 +2542,7 @@
           </w:p>
           <w:p>
             <w:pPr>
-              <w:spacing w:after="0" w:line="264"/>
+              <w:spacing w:after="0" w:line="290" w:lineRule="exact"/>
               <w:jc w:val="center"/>
             </w:pPr>
             <w:r>
@@ -2567,16 +2567,16 @@
               <w:right w:val="single" w:color="000000" w:sz="4"/>
             </w:tcBorders>
             <w:tcMar>
-              <w:top w:type="dxa" w:w="30"/>
-              <w:left w:type="dxa" w:w="90"/>
-              <w:bottom w:type="dxa" w:w="30"/>
-              <w:right w:type="dxa" w:w="90"/>
-            </w:tcMar>
-            <w:vAlign w:val="center"/>
-          </w:tcPr>
-          <w:p>
-            <w:pPr>
-              <w:spacing w:after="0" w:line="264"/>
+              <w:top w:type="dxa" w:w="20"/>
+              <w:left w:type="dxa" w:w="80"/>
+              <w:bottom w:type="dxa" w:w="20"/>
+              <w:right w:type="dxa" w:w="80"/>
+            </w:tcMar>
+            <w:vAlign w:val="center"/>
+          </w:tcPr>
+          <w:p>
+            <w:pPr>
+              <w:spacing w:after="0" w:line="290" w:lineRule="exact"/>
               <w:jc w:val="left"/>
             </w:pPr>
             <w:r>
@@ -2601,16 +2601,16 @@
               <w:right w:val="single" w:color="000000" w:sz="4"/>
             </w:tcBorders>
             <w:tcMar>
-              <w:top w:type="dxa" w:w="30"/>
-              <w:left w:type="dxa" w:w="90"/>
-              <w:bottom w:type="dxa" w:w="30"/>
-              <w:right w:type="dxa" w:w="90"/>
-            </w:tcMar>
-            <w:vAlign w:val="center"/>
-          </w:tcPr>
-          <w:p>
-            <w:pPr>
-              <w:spacing w:after="0" w:line="264"/>
+              <w:top w:type="dxa" w:w="20"/>
+              <w:left w:type="dxa" w:w="80"/>
+              <w:bottom w:type="dxa" w:w="20"/>
+              <w:right w:type="dxa" w:w="80"/>
+            </w:tcMar>
+            <w:vAlign w:val="center"/>
+          </w:tcPr>
+          <w:p>
+            <w:pPr>
+              <w:spacing w:after="0" w:line="290" w:lineRule="exact"/>
               <w:jc w:val="left"/>
             </w:pPr>
             <w:r>
@@ -2635,16 +2635,16 @@
               <w:right w:val="single" w:color="000000" w:sz="4"/>
             </w:tcBorders>
             <w:tcMar>
-              <w:top w:type="dxa" w:w="30"/>
-              <w:left w:type="dxa" w:w="90"/>
-              <w:bottom w:type="dxa" w:w="30"/>
-              <w:right w:type="dxa" w:w="90"/>
-            </w:tcMar>
-            <w:vAlign w:val="center"/>
-          </w:tcPr>
-          <w:p>
-            <w:pPr>
-              <w:spacing w:after="0" w:line="264"/>
+              <w:top w:type="dxa" w:w="20"/>
+              <w:left w:type="dxa" w:w="80"/>
+              <w:bottom w:type="dxa" w:w="20"/>
+              <w:right w:type="dxa" w:w="80"/>
+            </w:tcMar>
+            <w:vAlign w:val="center"/>
+          </w:tcPr>
+          <w:p>
+            <w:pPr>
+              <w:spacing w:after="0" w:line="290" w:lineRule="exact"/>
               <w:jc w:val="center"/>
             </w:pPr>
             <w:r>
@@ -2675,16 +2675,16 @@
               <w:right w:val="single" w:color="000000" w:sz="4"/>
             </w:tcBorders>
             <w:tcMar>
-              <w:top w:type="dxa" w:w="30"/>
-              <w:left w:type="dxa" w:w="90"/>
-              <w:bottom w:type="dxa" w:w="30"/>
-              <w:right w:type="dxa" w:w="90"/>
-            </w:tcMar>
-            <w:vAlign w:val="center"/>
-          </w:tcPr>
-          <w:p>
-            <w:pPr>
-              <w:spacing w:after="0" w:line="264"/>
+              <w:top w:type="dxa" w:w="20"/>
+              <w:left w:type="dxa" w:w="80"/>
+              <w:bottom w:type="dxa" w:w="20"/>
+              <w:right w:type="dxa" w:w="80"/>
+            </w:tcMar>
+            <w:vAlign w:val="center"/>
+          </w:tcPr>
+          <w:p>
+            <w:pPr>
+              <w:spacing w:after="0" w:line="290" w:lineRule="exact"/>
               <w:jc w:val="center"/>
             </w:pPr>
             <w:r>
@@ -2709,16 +2709,16 @@
               <w:right w:val="single" w:color="000000" w:sz="4"/>
             </w:tcBorders>
             <w:tcMar>
-              <w:top w:type="dxa" w:w="30"/>
-              <w:left w:type="dxa" w:w="90"/>
-              <w:bottom w:type="dxa" w:w="30"/>
-              <w:right w:type="dxa" w:w="90"/>
-            </w:tcMar>
-            <w:vAlign w:val="center"/>
-          </w:tcPr>
-          <w:p>
-            <w:pPr>
-              <w:spacing w:after="0" w:line="264"/>
+              <w:top w:type="dxa" w:w="20"/>
+              <w:left w:type="dxa" w:w="80"/>
+              <w:bottom w:type="dxa" w:w="20"/>
+              <w:right w:type="dxa" w:w="80"/>
+            </w:tcMar>
+            <w:vAlign w:val="center"/>
+          </w:tcPr>
+          <w:p>
+            <w:pPr>
+              <w:spacing w:after="0" w:line="290" w:lineRule="exact"/>
               <w:jc w:val="left"/>
             </w:pPr>
             <w:r>
@@ -2743,16 +2743,16 @@
               <w:right w:val="single" w:color="000000" w:sz="4"/>
             </w:tcBorders>
             <w:tcMar>
-              <w:top w:type="dxa" w:w="30"/>
-              <w:left w:type="dxa" w:w="90"/>
-              <w:bottom w:type="dxa" w:w="30"/>
-              <w:right w:type="dxa" w:w="90"/>
-            </w:tcMar>
-            <w:vAlign w:val="center"/>
-          </w:tcPr>
-          <w:p>
-            <w:pPr>
-              <w:spacing w:after="0" w:line="264"/>
+              <w:top w:type="dxa" w:w="20"/>
+              <w:left w:type="dxa" w:w="80"/>
+              <w:bottom w:type="dxa" w:w="20"/>
+              <w:right w:type="dxa" w:w="80"/>
+            </w:tcMar>
+            <w:vAlign w:val="center"/>
+          </w:tcPr>
+          <w:p>
+            <w:pPr>
+              <w:spacing w:after="0" w:line="290" w:lineRule="exact"/>
               <w:jc w:val="left"/>
             </w:pPr>
             <w:r>
@@ -2777,16 +2777,16 @@
               <w:right w:val="single" w:color="000000" w:sz="4"/>
             </w:tcBorders>
             <w:tcMar>
-              <w:top w:type="dxa" w:w="30"/>
-              <w:left w:type="dxa" w:w="90"/>
-              <w:bottom w:type="dxa" w:w="30"/>
-              <w:right w:type="dxa" w:w="90"/>
-            </w:tcMar>
-            <w:vAlign w:val="center"/>
-          </w:tcPr>
-          <w:p>
-            <w:pPr>
-              <w:spacing w:after="0" w:line="264"/>
+              <w:top w:type="dxa" w:w="20"/>
+              <w:left w:type="dxa" w:w="80"/>
+              <w:bottom w:type="dxa" w:w="20"/>
+              <w:right w:type="dxa" w:w="80"/>
+            </w:tcMar>
+            <w:vAlign w:val="center"/>
+          </w:tcPr>
+          <w:p>
+            <w:pPr>
+              <w:spacing w:after="0" w:line="290" w:lineRule="exact"/>
               <w:jc w:val="center"/>
             </w:pPr>
             <w:r>
@@ -2817,16 +2817,16 @@
               <w:right w:val="single" w:color="000000" w:sz="4"/>
             </w:tcBorders>
             <w:tcMar>
-              <w:top w:type="dxa" w:w="30"/>
-              <w:left w:type="dxa" w:w="90"/>
-              <w:bottom w:type="dxa" w:w="30"/>
-              <w:right w:type="dxa" w:w="90"/>
-            </w:tcMar>
-            <w:vAlign w:val="center"/>
-          </w:tcPr>
-          <w:p>
-            <w:pPr>
-              <w:spacing w:after="0" w:line="264"/>
+              <w:top w:type="dxa" w:w="20"/>
+              <w:left w:type="dxa" w:w="80"/>
+              <w:bottom w:type="dxa" w:w="20"/>
+              <w:right w:type="dxa" w:w="80"/>
+            </w:tcMar>
+            <w:vAlign w:val="center"/>
+          </w:tcPr>
+          <w:p>
+            <w:pPr>
+              <w:spacing w:after="0" w:line="290" w:lineRule="exact"/>
               <w:jc w:val="center"/>
             </w:pPr>
             <w:r>
@@ -2851,16 +2851,16 @@
               <w:right w:val="single" w:color="000000" w:sz="4"/>
             </w:tcBorders>
             <w:tcMar>
-              <w:top w:type="dxa" w:w="30"/>
-              <w:left w:type="dxa" w:w="90"/>
-              <w:bottom w:type="dxa" w:w="30"/>
-              <w:right w:type="dxa" w:w="90"/>
-            </w:tcMar>
-            <w:vAlign w:val="center"/>
-          </w:tcPr>
-          <w:p>
-            <w:pPr>
-              <w:spacing w:after="0" w:line="264"/>
+              <w:top w:type="dxa" w:w="20"/>
+              <w:left w:type="dxa" w:w="80"/>
+              <w:bottom w:type="dxa" w:w="20"/>
+              <w:right w:type="dxa" w:w="80"/>
+            </w:tcMar>
+            <w:vAlign w:val="center"/>
+          </w:tcPr>
+          <w:p>
+            <w:pPr>
+              <w:spacing w:after="0" w:line="290" w:lineRule="exact"/>
               <w:jc w:val="left"/>
             </w:pPr>
             <w:r>
@@ -2885,16 +2885,16 @@
               <w:right w:val="single" w:color="000000" w:sz="4"/>
             </w:tcBorders>
             <w:tcMar>
-              <w:top w:type="dxa" w:w="30"/>
-              <w:left w:type="dxa" w:w="90"/>
-              <w:bottom w:type="dxa" w:w="30"/>
-              <w:right w:type="dxa" w:w="90"/>
-            </w:tcMar>
-            <w:vAlign w:val="center"/>
-          </w:tcPr>
-          <w:p>
-            <w:pPr>
-              <w:spacing w:after="0" w:line="264"/>
+              <w:top w:type="dxa" w:w="20"/>
+              <w:left w:type="dxa" w:w="80"/>
+              <w:bottom w:type="dxa" w:w="20"/>
+              <w:right w:type="dxa" w:w="80"/>
+            </w:tcMar>
+            <w:vAlign w:val="center"/>
+          </w:tcPr>
+          <w:p>
+            <w:pPr>
+              <w:spacing w:after="0" w:line="290" w:lineRule="exact"/>
               <w:jc w:val="left"/>
             </w:pPr>
             <w:r>
@@ -2919,16 +2919,16 @@
               <w:right w:val="single" w:color="000000" w:sz="4"/>
             </w:tcBorders>
             <w:tcMar>
-              <w:top w:type="dxa" w:w="30"/>
-              <w:left w:type="dxa" w:w="90"/>
-              <w:bottom w:type="dxa" w:w="30"/>
-              <w:right w:type="dxa" w:w="90"/>
-            </w:tcMar>
-            <w:vAlign w:val="center"/>
-          </w:tcPr>
-          <w:p>
-            <w:pPr>
-              <w:spacing w:after="0" w:line="264"/>
+              <w:top w:type="dxa" w:w="20"/>
+              <w:left w:type="dxa" w:w="80"/>
+              <w:bottom w:type="dxa" w:w="20"/>
+              <w:right w:type="dxa" w:w="80"/>
+            </w:tcMar>
+            <w:vAlign w:val="center"/>
+          </w:tcPr>
+          <w:p>
+            <w:pPr>
+              <w:spacing w:after="0" w:line="290" w:lineRule="exact"/>
               <w:jc w:val="center"/>
             </w:pPr>
             <w:r>
@@ -2959,16 +2959,16 @@
               <w:right w:val="single" w:color="000000" w:sz="4"/>
             </w:tcBorders>
             <w:tcMar>
-              <w:top w:type="dxa" w:w="30"/>
-              <w:left w:type="dxa" w:w="90"/>
-              <w:bottom w:type="dxa" w:w="30"/>
-              <w:right w:type="dxa" w:w="90"/>
-            </w:tcMar>
-            <w:vAlign w:val="center"/>
-          </w:tcPr>
-          <w:p>
-            <w:pPr>
-              <w:spacing w:after="0" w:line="264"/>
+              <w:top w:type="dxa" w:w="20"/>
+              <w:left w:type="dxa" w:w="80"/>
+              <w:bottom w:type="dxa" w:w="20"/>
+              <w:right w:type="dxa" w:w="80"/>
+            </w:tcMar>
+            <w:vAlign w:val="center"/>
+          </w:tcPr>
+          <w:p>
+            <w:pPr>
+              <w:spacing w:after="0" w:line="290" w:lineRule="exact"/>
               <w:jc w:val="center"/>
             </w:pPr>
             <w:r>
@@ -2993,16 +2993,16 @@
               <w:right w:val="single" w:color="000000" w:sz="4"/>
             </w:tcBorders>
             <w:tcMar>
-              <w:top w:type="dxa" w:w="30"/>
-              <w:left w:type="dxa" w:w="90"/>
-              <w:bottom w:type="dxa" w:w="30"/>
-              <w:right w:type="dxa" w:w="90"/>
-            </w:tcMar>
-            <w:vAlign w:val="center"/>
-          </w:tcPr>
-          <w:p>
-            <w:pPr>
-              <w:spacing w:after="0" w:line="264"/>
+              <w:top w:type="dxa" w:w="20"/>
+              <w:left w:type="dxa" w:w="80"/>
+              <w:bottom w:type="dxa" w:w="20"/>
+              <w:right w:type="dxa" w:w="80"/>
+            </w:tcMar>
+            <w:vAlign w:val="center"/>
+          </w:tcPr>
+          <w:p>
+            <w:pPr>
+              <w:spacing w:after="0" w:line="290" w:lineRule="exact"/>
               <w:jc w:val="left"/>
             </w:pPr>
             <w:r>
@@ -3027,16 +3027,16 @@
               <w:right w:val="single" w:color="000000" w:sz="4"/>
             </w:tcBorders>
             <w:tcMar>
-              <w:top w:type="dxa" w:w="30"/>
-              <w:left w:type="dxa" w:w="90"/>
-              <w:bottom w:type="dxa" w:w="30"/>
-              <w:right w:type="dxa" w:w="90"/>
-            </w:tcMar>
-            <w:vAlign w:val="center"/>
-          </w:tcPr>
-          <w:p>
-            <w:pPr>
-              <w:spacing w:after="0" w:line="264"/>
+              <w:top w:type="dxa" w:w="20"/>
+              <w:left w:type="dxa" w:w="80"/>
+              <w:bottom w:type="dxa" w:w="20"/>
+              <w:right w:type="dxa" w:w="80"/>
+            </w:tcMar>
+            <w:vAlign w:val="center"/>
+          </w:tcPr>
+          <w:p>
+            <w:pPr>
+              <w:spacing w:after="0" w:line="290" w:lineRule="exact"/>
               <w:jc w:val="left"/>
             </w:pPr>
             <w:r>
@@ -3061,16 +3061,16 @@
               <w:right w:val="single" w:color="000000" w:sz="4"/>
             </w:tcBorders>
             <w:tcMar>
-              <w:top w:type="dxa" w:w="30"/>
-              <w:left w:type="dxa" w:w="90"/>
-              <w:bottom w:type="dxa" w:w="30"/>
-              <w:right w:type="dxa" w:w="90"/>
-            </w:tcMar>
-            <w:vAlign w:val="center"/>
-          </w:tcPr>
-          <w:p>
-            <w:pPr>
-              <w:spacing w:after="0" w:line="264"/>
+              <w:top w:type="dxa" w:w="20"/>
+              <w:left w:type="dxa" w:w="80"/>
+              <w:bottom w:type="dxa" w:w="20"/>
+              <w:right w:type="dxa" w:w="80"/>
+            </w:tcMar>
+            <w:vAlign w:val="center"/>
+          </w:tcPr>
+          <w:p>
+            <w:pPr>
+              <w:spacing w:after="0" w:line="290" w:lineRule="exact"/>
               <w:jc w:val="center"/>
             </w:pPr>
             <w:r>

</xml_diff>